<commit_message>
feat(ui-2027): Tem gửi hàng — datepicker, tên khách IN HOA, địa chỉ hóa đơn, bỏ tô vàng docx
- Ngày: DateField (DD/MM/YYYY), lưu ISO -> đổi DD/MM/YYYY khi xuất
- Tên khách hàng: IN HOA (prefill .toUpperCase + onChange ép hoa + class uppercase)
- Địa chỉ: prefill địa chỉ hóa đơn (cụm ưu tiên, fallback điểm máy) — thêm embed soct_khach_cum(dia_chi) vào list cong-viec + Job type
- Template tem-gui-hang.docx: xóa 7 w:highlight vàng (chỉ là đánh dấu vị trí placeholder)

Co-Authored-By: Claude Opus 4.8 <noreply@anthropic.com>
</commit_message>
<xml_diff>
--- a/src/lib/report/tem-gui-hang.docx
+++ b/src/lib/report/tem-gui-hang.docx
@@ -125,14 +125,10 @@
           <w:p>
             <w:pPr>
               <w:jc w:val="center"/>
-              <w:rPr>
-                <w:highlight w:val="yellow"/>
-              </w:rPr>
+              <w:rPr/>
             </w:pPr>
             <w:r>
-              <w:rPr>
-                <w:highlight w:val="yellow"/>
-              </w:rPr>
+              <w:rPr/>
               <w:t>{{NGAY}}</w:t>
             </w:r>
             <w:bookmarkStart w:id="0" w:name="_GoBack"/>
@@ -195,7 +191,6 @@
             <w:r>
               <w:rPr>
                 <w:sz w:val="28"/>
-                <w:highlight w:val="yellow"/>
               </w:rPr>
               <w:t>{{NGUOI_NHAN}}</w:t>
             </w:r>
@@ -243,7 +238,6 @@
               <w:rPr>
                 <w:b/>
                 <w:sz w:val="32"/>
-                <w:highlight w:val="yellow"/>
               </w:rPr>
               <w:t>{{KHACH_HANG}}</w:t>
             </w:r>
@@ -302,7 +296,6 @@
             <w:r>
               <w:rPr>
                 <w:sz w:val="28"/>
-                <w:highlight w:val="yellow"/>
               </w:rPr>
               <w:t>{{DIA_CHI}}</w:t>
             </w:r>
@@ -359,7 +352,6 @@
             <w:r>
               <w:rPr>
                 <w:noProof/>
-                <w:highlight w:val="yellow"/>
               </w:rPr>
               <mc:AlternateContent>
                 <mc:Choice Requires="wps">
@@ -531,7 +523,6 @@
             <w:r>
               <w:rPr>
                 <w:sz w:val="28"/>
-                <w:highlight w:val="yellow"/>
               </w:rPr>
               <w:t>{{NOI_DUNG}}</w:t>
             </w:r>

</xml_diff>

<commit_message>
feat(ui-2027): Tem gửi hàng — địa chỉ = vị trí đặt máy (fallback địa chỉ điểm máy) + thay template mới
- Địa chỉ prefill: vi_tri_dat_may || dia_chi điểm máy (bỏ embed cụm, revert query cong-viec + Job type)
- Người nhận giữ = ghi chú phiếu; tên khách IN HOA
- Thay template tem-gui-hang.docx bằng bản user chỉnh (desktop): chèn lại 5 placeholder, A4, không tô vàng

Co-Authored-By: Claude Opus 4.8 <noreply@anthropic.com>
</commit_message>
<xml_diff>
--- a/src/lib/report/tem-gui-hang.docx
+++ b/src/lib/report/tem-gui-hang.docx
@@ -11,7 +11,8 @@
       </w:tblPr>
       <w:tblGrid>
         <w:gridCol w:w="2796"/>
-        <w:gridCol w:w="6702"/>
+        <w:gridCol w:w="6277"/>
+        <w:gridCol w:w="425"/>
         <w:gridCol w:w="1418"/>
       </w:tblGrid>
       <w:tr>
@@ -79,6 +80,7 @@
         <w:tc>
           <w:tcPr>
             <w:tcW w:w="6702" w:type="dxa"/>
+            <w:gridSpan w:val="2"/>
             <w:tcBorders>
               <w:left w:val="nil"/>
               <w:bottom w:val="single" w:sz="4" w:space="0" w:color="auto"/>
@@ -101,10 +103,7 @@
           </w:p>
           <w:p>
             <w:r>
-              <w:t>Số 5 Nguyễn Ngọc Vũ, Phường Thanh Xuân, TP Hà Nộ</w:t>
-            </w:r>
-            <w:r>
-              <w:t>i</w:t>
+              <w:t>Số 5 Nguyễn Ngọc Vũ, Phường Thanh Xuân, TP Hà Nội</w:t>
             </w:r>
           </w:p>
           <w:p>
@@ -125,14 +124,10 @@
           <w:p>
             <w:pPr>
               <w:jc w:val="center"/>
-              <w:rPr/>
             </w:pPr>
             <w:r>
-              <w:rPr/>
               <w:t>{{NGAY}}</w:t>
             </w:r>
-            <w:bookmarkStart w:id="0" w:name="_GoBack"/>
-            <w:bookmarkEnd w:id="0"/>
           </w:p>
         </w:tc>
       </w:tr>
@@ -175,7 +170,7 @@
         <w:tc>
           <w:tcPr>
             <w:tcW w:w="8120" w:type="dxa"/>
-            <w:gridSpan w:val="2"/>
+            <w:gridSpan w:val="3"/>
             <w:tcBorders>
               <w:left w:val="nil"/>
               <w:bottom w:val="nil"/>
@@ -221,7 +216,7 @@
         <w:tc>
           <w:tcPr>
             <w:tcW w:w="8120" w:type="dxa"/>
-            <w:gridSpan w:val="2"/>
+            <w:gridSpan w:val="3"/>
             <w:tcBorders>
               <w:top w:val="nil"/>
               <w:left w:val="nil"/>
@@ -279,7 +274,31 @@
         </w:tc>
         <w:tc>
           <w:tcPr>
-            <w:tcW w:w="8120" w:type="dxa"/>
+            <w:tcW w:w="6277" w:type="dxa"/>
+            <w:tcBorders>
+              <w:top w:val="nil"/>
+              <w:left w:val="nil"/>
+              <w:bottom w:val="nil"/>
+              <w:right w:val="nil"/>
+            </w:tcBorders>
+          </w:tcPr>
+          <w:p>
+            <w:pPr>
+              <w:rPr>
+                <w:sz w:val="28"/>
+              </w:rPr>
+            </w:pPr>
+            <w:r>
+              <w:rPr>
+                <w:sz w:val="28"/>
+              </w:rPr>
+              <w:t>{{DIA_CHI}}</w:t>
+            </w:r>
+          </w:p>
+        </w:tc>
+        <w:tc>
+          <w:tcPr>
+            <w:tcW w:w="1843" w:type="dxa"/>
             <w:gridSpan w:val="2"/>
             <w:tcBorders>
               <w:top w:val="nil"/>
@@ -293,12 +312,6 @@
                 <w:sz w:val="28"/>
               </w:rPr>
             </w:pPr>
-            <w:r>
-              <w:rPr>
-                <w:sz w:val="28"/>
-              </w:rPr>
-              <w:t>{{DIA_CHI}}</w:t>
-            </w:r>
           </w:p>
         </w:tc>
       </w:tr>
@@ -337,7 +350,7 @@
         <w:tc>
           <w:tcPr>
             <w:tcW w:w="8120" w:type="dxa"/>
-            <w:gridSpan w:val="2"/>
+            <w:gridSpan w:val="3"/>
             <w:tcBorders>
               <w:top w:val="nil"/>
               <w:left w:val="nil"/>
@@ -414,9 +427,9 @@
                                     </w:rPr>
                                     <w:drawing>
                                       <wp:inline distT="0" distB="0" distL="0" distR="0" wp14:anchorId="6CCDEC6F" wp14:editId="51C40C45">
-                                        <wp:extent cx="1017905" cy="1412875"/>
+                                        <wp:extent cx="977189" cy="1356360"/>
                                         <wp:effectExtent l="0" t="0" r="0" b="0"/>
-                                        <wp:docPr id="1" name="Picture 1"/>
+                                        <wp:docPr id="2" name="Picture 2"/>
                                         <wp:cNvGraphicFramePr>
                                           <a:graphicFrameLocks xmlns:a="http://schemas.openxmlformats.org/drawingml/2006/main" noChangeAspect="1"/>
                                         </wp:cNvGraphicFramePr>
@@ -436,7 +449,7 @@
                                               <pic:spPr>
                                                 <a:xfrm>
                                                   <a:off x="0" y="0"/>
-                                                  <a:ext cx="1017905" cy="1412875"/>
+                                                  <a:ext cx="1003828" cy="1393336"/>
                                                 </a:xfrm>
                                                 <a:prstGeom prst="rect">
                                                   <a:avLst/>
@@ -478,9 +491,9 @@
                               </w:rPr>
                               <w:drawing>
                                 <wp:inline distT="0" distB="0" distL="0" distR="0" wp14:anchorId="6CCDEC6F" wp14:editId="51C40C45">
-                                  <wp:extent cx="1017905" cy="1412875"/>
+                                  <wp:extent cx="977189" cy="1356360"/>
                                   <wp:effectExtent l="0" t="0" r="0" b="0"/>
-                                  <wp:docPr id="1" name="Picture 1"/>
+                                  <wp:docPr id="2" name="Picture 2"/>
                                   <wp:cNvGraphicFramePr>
                                     <a:graphicFrameLocks xmlns:a="http://schemas.openxmlformats.org/drawingml/2006/main" noChangeAspect="1"/>
                                   </wp:cNvGraphicFramePr>
@@ -500,7 +513,7 @@
                                         <pic:spPr>
                                           <a:xfrm>
                                             <a:off x="0" y="0"/>
-                                            <a:ext cx="1017905" cy="1412875"/>
+                                            <a:ext cx="1003828" cy="1393336"/>
                                           </a:xfrm>
                                           <a:prstGeom prst="rect">
                                             <a:avLst/>
@@ -536,7 +549,7 @@
         <w:tc>
           <w:tcPr>
             <w:tcW w:w="10916" w:type="dxa"/>
-            <w:gridSpan w:val="3"/>
+            <w:gridSpan w:val="4"/>
             <w:vAlign w:val="center"/>
           </w:tcPr>
           <w:p>
@@ -642,7 +655,10 @@
         </mc:AlternateContent>
       </w:r>
     </w:p>
-    <w:p/>
+    <w:p>
+      <w:bookmarkStart w:id="0" w:name="_GoBack"/>
+      <w:bookmarkEnd w:id="0"/>
+    </w:p>
     <w:sectPr>
       <w:pgSz w:w="11906" w:h="16838"/>
       <w:pgMar w:top="568" w:right="851" w:bottom="1418" w:left="1701" w:header="720" w:footer="720" w:gutter="0"/>

</xml_diff>